<commit_message>
Karty pracy M. Czerw: usunięto numery podzadań
Co-Authored-By: Claude Sonnet 5.5 <noreply@anthropic.com>
Claude-Session: https://claude.ai/code/session_01Tjc2hnwuZeEHHZpW9z6Grg
</commit_message>
<xml_diff>
--- a/karty_pracy_zadanie3/12._Monika_Czerw_Karty_czasu_pracy_09.2026-04.2027.docx
+++ b/karty_pracy_zadanie3/12._Monika_Czerw_Karty_czasu_pracy_09.2026-04.2027.docx
@@ -450,7 +450,7 @@
               <w:rPr>
                 <w:rFonts w:ascii="Calibri" w:eastAsia="Calibri" w:hAnsi="Calibri" w:cs="Calibri"/>
               </w:rPr>
-              <w:t>Udział w opracowaniu dodatkowych funkcjonalności środowiska badawczego (Podzadanie 2), opracowaniu algorytmów w celu analizy sentymentu (Podzadanie 3) oraz dopracowaniu modeli AI (Podzadanie 4).</w:t>
+              <w:t>Udział w opracowaniu dodatkowych funkcjonalności środowiska badawczego, opracowaniu algorytmów w celu analizy sentymentu oraz dopracowaniu modeli AI.</w:t>
             </w:r>
           </w:p>
         </w:tc>
@@ -1216,7 +1216,7 @@
               <w:rPr>
                 <w:rFonts w:ascii="Calibri" w:eastAsia="Calibri" w:hAnsi="Calibri" w:cs="Calibri"/>
               </w:rPr>
-              <w:t>Udział w opracowaniu dodatkowych funkcjonalności środowiska badawczego (Podzadanie 2), opracowaniu algorytmów w celu analizy sentymentu (Podzadanie 3) oraz dopracowaniu modeli AI (Podzadanie 4).</w:t>
+              <w:t>Udział w opracowaniu dodatkowych funkcjonalności środowiska badawczego, opracowaniu algorytmów w celu analizy sentymentu oraz dopracowaniu modeli AI.</w:t>
             </w:r>
           </w:p>
         </w:tc>
@@ -1982,7 +1982,7 @@
               <w:rPr>
                 <w:rFonts w:ascii="Calibri" w:eastAsia="Calibri" w:hAnsi="Calibri" w:cs="Calibri"/>
               </w:rPr>
-              <w:t>Udział w opracowaniu dodatkowych funkcjonalności środowiska badawczego (Podzadanie 2), opracowaniu algorytmów w celu analizy sentymentu (Podzadanie 3) oraz dopracowaniu modeli AI (Podzadanie 4).</w:t>
+              <w:t>Udział w opracowaniu dodatkowych funkcjonalności środowiska badawczego, opracowaniu algorytmów w celu analizy sentymentu oraz dopracowaniu modeli AI.</w:t>
             </w:r>
           </w:p>
         </w:tc>
@@ -2748,7 +2748,7 @@
               <w:rPr>
                 <w:rFonts w:ascii="Calibri" w:eastAsia="Calibri" w:hAnsi="Calibri" w:cs="Calibri"/>
               </w:rPr>
-              <w:t>Udział w opracowaniu dodatkowych funkcjonalności środowiska badawczego (Podzadanie 2), opracowaniu algorytmów w celu analizy sentymentu (Podzadanie 3) oraz dopracowaniu modeli AI (Podzadanie 4).</w:t>
+              <w:t>Udział w opracowaniu dodatkowych funkcjonalności środowiska badawczego, opracowaniu algorytmów w celu analizy sentymentu oraz dopracowaniu modeli AI.</w:t>
             </w:r>
           </w:p>
         </w:tc>
@@ -3514,7 +3514,7 @@
               <w:rPr>
                 <w:rFonts w:ascii="Calibri" w:eastAsia="Calibri" w:hAnsi="Calibri" w:cs="Calibri"/>
               </w:rPr>
-              <w:t>Udział w opracowaniu dodatkowych funkcjonalności środowiska badawczego (Podzadanie 2), opracowaniu algorytmów w celu analizy sentymentu (Podzadanie 3) oraz dopracowaniu modeli AI (Podzadanie 4).</w:t>
+              <w:t>Udział w opracowaniu dodatkowych funkcjonalności środowiska badawczego, opracowaniu algorytmów w celu analizy sentymentu oraz dopracowaniu modeli AI.</w:t>
             </w:r>
           </w:p>
         </w:tc>
@@ -4280,7 +4280,7 @@
               <w:rPr>
                 <w:rFonts w:ascii="Calibri" w:eastAsia="Calibri" w:hAnsi="Calibri" w:cs="Calibri"/>
               </w:rPr>
-              <w:t>Udział w opracowaniu dodatkowych funkcjonalności środowiska badawczego (Podzadanie 2), opracowaniu algorytmów w celu analizy sentymentu (Podzadanie 3) oraz dopracowaniu modeli AI (Podzadanie 4).</w:t>
+              <w:t>Udział w opracowaniu dodatkowych funkcjonalności środowiska badawczego, opracowaniu algorytmów w celu analizy sentymentu oraz dopracowaniu modeli AI.</w:t>
             </w:r>
           </w:p>
         </w:tc>
@@ -5046,7 +5046,7 @@
               <w:rPr>
                 <w:rFonts w:ascii="Calibri" w:eastAsia="Calibri" w:hAnsi="Calibri" w:cs="Calibri"/>
               </w:rPr>
-              <w:t>Udział w opracowaniu dodatkowych funkcjonalności środowiska badawczego (Podzadanie 2), opracowaniu algorytmów w celu analizy sentymentu (Podzadanie 3) oraz dopracowaniu modeli AI (Podzadanie 4).</w:t>
+              <w:t>Udział w opracowaniu dodatkowych funkcjonalności środowiska badawczego, opracowaniu algorytmów w celu analizy sentymentu oraz dopracowaniu modeli AI.</w:t>
             </w:r>
           </w:p>
         </w:tc>
@@ -5812,7 +5812,7 @@
               <w:rPr>
                 <w:rFonts w:ascii="Calibri" w:eastAsia="Calibri" w:hAnsi="Calibri" w:cs="Calibri"/>
               </w:rPr>
-              <w:t>Udział w opracowaniu dodatkowych funkcjonalności środowiska badawczego (Podzadanie 2), opracowaniu algorytmów w celu analizy sentymentu (Podzadanie 3) oraz dopracowaniu modeli AI (Podzadanie 4).</w:t>
+              <w:t>Udział w opracowaniu dodatkowych funkcjonalności środowiska badawczego, opracowaniu algorytmów w celu analizy sentymentu oraz dopracowaniu modeli AI.</w:t>
             </w:r>
           </w:p>
         </w:tc>

</xml_diff>